<commit_message>
Rename certification PCAP to PCAIP
The Python Institute already owns PCAP (Certified Associate in Python
Programming), so the Proxiant credential now abbreviates as PCAIP
(Proxiant Certified AI Professional); bootcamp tracks become
PCAIP-Agents and PCAIP-RAG. Full credential name, pricing, and exam
specs unchanged. Applied case-sensitively across all catalogues,
syllabi, certification tests, class notes, slides, indexes, README,
and generator sources; bootcamp docs regenerated (exam files now
PCAIP_*); Fundamentals PDFs regenerated. The lowercase packet-capture
"pcap" reference in the Week 9 networking lab is intentionally
untouched. Verified zero PCAP occurrences remain in text, filenames,
or sources.

Co-Authored-By: Claude Fable 5 <noreply@anthropic.com>
</commit_message>
<xml_diff>
--- a/AI Fundamentals Course/AI_Fundamentals_Course_Catalogue.docx
+++ b/AI Fundamentals Course/AI_Fundamentals_Course_Catalogue.docx
@@ -102,6 +102,8 @@
     <w:p>
       <w:pPr>
         <w:sectPr>
+          <w:footerReference w:type="default" r:id="rId11"/>
+          <w:headerReference w:type="default" r:id="rId12"/>
           <w:pgSz w:w="12240" w:h="15840"/>
           <w:pgMar w:top="1440" w:right="1440" w:bottom="1440" w:left="1440" w:header="708" w:footer="708" w:gutter="0"/>
           <w:cols w:space="720"/>
@@ -506,7 +508,7 @@
           </w:tcPr>
           <w:p>
             <w:r>
-              <w:t>Proxiant Academy PCAP Certificate upon passing final assessment</w:t>
+              <w:t>Proxiant Academy PCAIP Certificate upon passing final assessment</w:t>
             </w:r>
           </w:p>
         </w:tc>
@@ -2042,11 +2044,9 @@
           <w:b/>
           <w:bCs/>
         </w:rPr>
-        <w:t xml:space="preserve">Certificate: </w:t>
-      </w:r>
-      <w:r>
-        <w:t>Proxiant Academy PCAP (Proxiant Certified AI Professional) Certificate, verifiable through our online credential system.</w:t>
-      </w:r>
+        <w:t>Certificate: Proxiant Academy PCAIP (Proxiant Certified AI Professional) Certificate, verifiable through our online credential system.</w:t>
+      </w:r>
+      <w:r/>
     </w:p>
     <w:p>
       <w:pPr>
@@ -2058,8 +2058,7 @@
         <w:pStyle w:val="Heading2"/>
       </w:pPr>
       <w:r>
-        <w:lastRenderedPageBreak/>
-        <w:t>PCAP Certification Details</w:t>
+        <w:t>PCAIP Certification Details</w:t>
       </w:r>
     </w:p>
     <w:p>
@@ -2067,7 +2066,7 @@
         <w:spacing w:after="120"/>
       </w:pPr>
       <w:r>
-        <w:t>Upon successful completion of the AI Fundamentals course, you become eligible for the Proxiant Certified AI Professional (PCAP) exam:</w:t>
+        <w:t>Upon successful completion of the AI Fundamentals course, you become eligible for the Proxiant Certified AI Professional (PCAIP) exam:</w:t>
       </w:r>
     </w:p>
     <w:tbl>
@@ -2144,7 +2143,7 @@
           </w:tcPr>
           <w:p>
             <w:r>
-              <w:t>Proxiant Certified AI Professional (PCAP)</w:t>
+              <w:t>Proxiant Certified AI Professional (PCAIP)</w:t>
             </w:r>
           </w:p>
         </w:tc>
@@ -2599,7 +2598,7 @@
         <w:spacing w:after="80"/>
       </w:pPr>
       <w:r>
-        <w:t>PCAP exam preparation materials and practice tests</w:t>
+        <w:t>PCAIP exam preparation materials and practice tests</w:t>
       </w:r>
     </w:p>
     <w:p>
@@ -2690,7 +2689,7 @@
         <w:spacing w:after="80"/>
       </w:pPr>
       <w:r>
-        <w:t>Industry-recognized PCAP certification upon successful completion</w:t>
+        <w:t>Industry-recognized PCAIP certification upon successful completion</w:t>
       </w:r>
     </w:p>
     <w:p>
@@ -2831,6 +2830,16 @@
 </w:ftr>
 </file>
 
+<file path=word/footer2.xml><?xml version="1.0" encoding="utf-8"?>
+<w:ftr xmlns:m="http://schemas.openxmlformats.org/officeDocument/2006/math" xmlns:mc="http://schemas.openxmlformats.org/markup-compatibility/2006" xmlns:mo="http://schemas.microsoft.com/office/mac/office/2008/main" xmlns:mv="urn:schemas-microsoft-com:mac:vml" xmlns:o="urn:schemas-microsoft-com:office:office" xmlns:r="http://schemas.openxmlformats.org/officeDocument/2006/relationships" xmlns:v="urn:schemas-microsoft-com:vml" xmlns:w10="urn:schemas-microsoft-com:office:word" xmlns:w14="http://schemas.microsoft.com/office/word/2010/wordml" xmlns:w="http://schemas.openxmlformats.org/wordprocessingml/2006/main" xmlns:wne="http://schemas.microsoft.com/office/word/2006/wordml" xmlns:wp14="http://schemas.microsoft.com/office/word/2010/wordprocessingDrawing" xmlns:wp="http://schemas.openxmlformats.org/drawingml/2006/wordprocessingDrawing" xmlns:wpc="http://schemas.microsoft.com/office/word/2010/wordprocessingCanvas" xmlns:wpg="http://schemas.microsoft.com/office/word/2010/wordprocessingGroup" xmlns:wpi="http://schemas.microsoft.com/office/word/2010/wordprocessingInk" xmlns:wps="http://schemas.microsoft.com/office/word/2010/wordprocessingShape" mc:Ignorable="w14 wp14">
+  <w:p>
+    <w:pPr>
+      <w:pStyle w:val="Footer"/>
+    </w:pPr>
+  </w:p>
+</w:ftr>
+</file>
+
 <file path=word/footnotes.xml><?xml version="1.0" encoding="utf-8"?>
 <w:footnotes xmlns:wpc="http://schemas.microsoft.com/office/word/2010/wordprocessingCanvas" xmlns:cx="http://schemas.microsoft.com/office/drawing/2014/chartex" xmlns:cx1="http://schemas.microsoft.com/office/drawing/2015/9/8/chartex" xmlns:cx2="http://schemas.microsoft.com/office/drawing/2015/10/21/chartex" xmlns:cx3="http://schemas.microsoft.com/office/drawing/2016/5/9/chartex" xmlns:cx4="http://schemas.microsoft.com/office/drawing/2016/5/10/chartex" xmlns:cx5="http://schemas.microsoft.com/office/drawing/2016/5/11/chartex" xmlns:cx6="http://schemas.microsoft.com/office/drawing/2016/5/12/chartex" xmlns:cx7="http://schemas.microsoft.com/office/drawing/2016/5/13/chartex" xmlns:cx8="http://schemas.microsoft.com/office/drawing/2016/5/14/chartex" xmlns:mc="http://schemas.openxmlformats.org/markup-compatibility/2006" xmlns:aink="http://schemas.microsoft.com/office/drawing/2016/ink" xmlns:am3d="http://schemas.microsoft.com/office/drawing/2017/model3d" xmlns:o="urn:schemas-microsoft-com:office:office" xmlns:oel="http://schemas.microsoft.com/office/2019/extlst" xmlns:r="http://schemas.openxmlformats.org/officeDocument/2006/relationships" xmlns:m="http://schemas.openxmlformats.org/officeDocument/2006/math" xmlns:v="urn:schemas-microsoft-com:vml" xmlns:wp14="http://schemas.microsoft.com/office/word/2010/wordprocessingDrawing" xmlns:wp="http://schemas.openxmlformats.org/drawingml/2006/wordprocessingDrawing" xmlns:w10="urn:schemas-microsoft-com:office:word" xmlns:w="http://schemas.openxmlformats.org/wordprocessingml/2006/main" xmlns:w14="http://schemas.microsoft.com/office/word/2010/wordml" xmlns:w15="http://schemas.microsoft.com/office/word/2012/wordml" xmlns:w16cex="http://schemas.microsoft.com/office/word/2018/wordml/cex" xmlns:w16cid="http://schemas.microsoft.com/office/word/2016/wordml/cid" xmlns:w16="http://schemas.microsoft.com/office/word/2018/wordml" xmlns:w16du="http://schemas.microsoft.com/office/word/2023/wordml/word16du" xmlns:w16sdtdh="http://schemas.microsoft.com/office/word/2020/wordml/sdtdatahash" xmlns:w16sdtfl="http://schemas.microsoft.com/office/word/2024/wordml/sdtformatlock" xmlns:w16se="http://schemas.microsoft.com/office/word/2015/wordml/symex" xmlns:wpg="http://schemas.microsoft.com/office/word/2010/wordprocessingGroup" xmlns:wpi="http://schemas.microsoft.com/office/word/2010/wordprocessingInk" xmlns:wne="http://schemas.microsoft.com/office/word/2006/wordml" xmlns:wps="http://schemas.microsoft.com/office/word/2010/wordprocessingShape" mc:Ignorable="w14 w15 w16se w16cid w16 w16cex w16sdtdh w16sdtfl w16du wp14">
   <w:footnote w:type="separator" w:id="-1">
@@ -2866,6 +2875,16 @@
       </w:rPr>
       <w:t>Proxiant Academy | AI Fundamentals</w:t>
     </w:r>
+  </w:p>
+</w:hdr>
+</file>
+
+<file path=word/header2.xml><?xml version="1.0" encoding="utf-8"?>
+<w:hdr xmlns:m="http://schemas.openxmlformats.org/officeDocument/2006/math" xmlns:mc="http://schemas.openxmlformats.org/markup-compatibility/2006" xmlns:mo="http://schemas.microsoft.com/office/mac/office/2008/main" xmlns:mv="urn:schemas-microsoft-com:mac:vml" xmlns:o="urn:schemas-microsoft-com:office:office" xmlns:r="http://schemas.openxmlformats.org/officeDocument/2006/relationships" xmlns:v="urn:schemas-microsoft-com:vml" xmlns:w10="urn:schemas-microsoft-com:office:word" xmlns:w14="http://schemas.microsoft.com/office/word/2010/wordml" xmlns:w="http://schemas.openxmlformats.org/wordprocessingml/2006/main" xmlns:wne="http://schemas.microsoft.com/office/word/2006/wordml" xmlns:wp14="http://schemas.microsoft.com/office/word/2010/wordprocessingDrawing" xmlns:wp="http://schemas.openxmlformats.org/drawingml/2006/wordprocessingDrawing" xmlns:wpc="http://schemas.microsoft.com/office/word/2010/wordprocessingCanvas" xmlns:wpg="http://schemas.microsoft.com/office/word/2010/wordprocessingGroup" xmlns:wpi="http://schemas.microsoft.com/office/word/2010/wordprocessingInk" xmlns:wps="http://schemas.microsoft.com/office/word/2010/wordprocessingShape" mc:Ignorable="w14 wp14">
+  <w:p>
+    <w:pPr>
+      <w:pStyle w:val="Header"/>
+    </w:pPr>
   </w:p>
 </w:hdr>
 </file>

</xml_diff>